<commit_message>
Tasks for tutorial 5
</commit_message>
<xml_diff>
--- a/peer_review.docx
+++ b/peer_review.docx
@@ -162,6 +162,26 @@
           <w:lang w:val="en-GB"/>
         </w:rPr>
         <w:t xml:space="preserve">The repository and requirements are well described but the research question is missing. </w:t>
+      </w:r>
+    </w:p>
+    <w:p>
+      <w:pPr>
+        <w:rPr>
+          <w:lang w:val="en-GB"/>
+        </w:rPr>
+      </w:pPr>
+    </w:p>
+    <w:p>
+      <w:pPr>
+        <w:rPr>
+          <w:lang w:val="en-GB"/>
+        </w:rPr>
+      </w:pPr>
+      <w:r>
+        <w:rPr>
+          <w:lang w:val="en-GB"/>
+        </w:rPr>
+        <w:t>Y is both, number space dot etc</w:t>
       </w:r>
     </w:p>
     <w:sectPr>

</xml_diff>